<commit_message>
Updated the formatting of the full cv and correct RSLondon from presentation to poster.
</commit_message>
<xml_diff>
--- a/Resume/amalieshi_full_resume.docx
+++ b/Resume/amalieshi_full_resume.docx
@@ -182,7 +182,7 @@
     <w:p>
       <w:pPr>
         <w:tabs>
-          <w:tab w:val="right" w:pos="9360"/>
+          <w:tab w:val="right" w:pos="10800"/>
         </w:tabs>
         <w:spacing w:before="160" w:after="40"/>
         <w:rPr>
@@ -226,6 +226,7 @@
           <w:numId w:val="2"/>
         </w:numPr>
         <w:spacing w:before="40" w:after="40"/>
+        <w:jc w:val="both"/>
         <w:rPr>
           <w:rFonts w:ascii="Times New Roman" w:hAnsi="Times New Roman" w:cs="Times New Roman"/>
         </w:rPr>
@@ -245,6 +246,7 @@
           <w:numId w:val="2"/>
         </w:numPr>
         <w:spacing w:before="40" w:after="40"/>
+        <w:jc w:val="both"/>
         <w:rPr>
           <w:rFonts w:ascii="Times New Roman" w:hAnsi="Times New Roman" w:cs="Times New Roman"/>
         </w:rPr>
@@ -264,6 +266,7 @@
           <w:numId w:val="2"/>
         </w:numPr>
         <w:spacing w:before="40" w:after="40"/>
+        <w:jc w:val="both"/>
         <w:rPr>
           <w:rFonts w:ascii="Times New Roman" w:hAnsi="Times New Roman" w:cs="Times New Roman"/>
         </w:rPr>
@@ -283,6 +286,7 @@
           <w:numId w:val="2"/>
         </w:numPr>
         <w:spacing w:before="40" w:after="40"/>
+        <w:jc w:val="both"/>
         <w:rPr>
           <w:rFonts w:ascii="Times New Roman" w:hAnsi="Times New Roman" w:cs="Times New Roman"/>
         </w:rPr>
@@ -297,7 +301,7 @@
     <w:p>
       <w:pPr>
         <w:tabs>
-          <w:tab w:val="right" w:pos="9360"/>
+          <w:tab w:val="right" w:pos="10800"/>
         </w:tabs>
         <w:spacing w:before="160" w:after="40"/>
         <w:rPr>
@@ -341,6 +345,7 @@
           <w:numId w:val="2"/>
         </w:numPr>
         <w:spacing w:before="40" w:after="40"/>
+        <w:jc w:val="both"/>
         <w:rPr>
           <w:rFonts w:ascii="Times New Roman" w:hAnsi="Times New Roman" w:cs="Times New Roman"/>
         </w:rPr>
@@ -360,6 +365,7 @@
           <w:numId w:val="2"/>
         </w:numPr>
         <w:spacing w:before="40" w:after="40"/>
+        <w:jc w:val="both"/>
         <w:rPr>
           <w:rFonts w:ascii="Times New Roman" w:hAnsi="Times New Roman" w:cs="Times New Roman"/>
         </w:rPr>
@@ -379,6 +385,7 @@
           <w:numId w:val="2"/>
         </w:numPr>
         <w:spacing w:before="40" w:after="40"/>
+        <w:jc w:val="both"/>
         <w:rPr>
           <w:rFonts w:ascii="Times New Roman" w:hAnsi="Times New Roman" w:cs="Times New Roman"/>
         </w:rPr>
@@ -398,6 +405,7 @@
           <w:numId w:val="2"/>
         </w:numPr>
         <w:spacing w:before="40" w:after="40"/>
+        <w:jc w:val="both"/>
         <w:rPr>
           <w:rFonts w:ascii="Times New Roman" w:hAnsi="Times New Roman" w:cs="Times New Roman"/>
         </w:rPr>
@@ -412,7 +420,7 @@
     <w:p>
       <w:pPr>
         <w:tabs>
-          <w:tab w:val="right" w:pos="9360"/>
+          <w:tab w:val="right" w:pos="10800"/>
         </w:tabs>
         <w:spacing w:before="160" w:after="40"/>
         <w:rPr>
@@ -456,6 +464,7 @@
           <w:numId w:val="2"/>
         </w:numPr>
         <w:spacing w:before="40" w:after="40"/>
+        <w:jc w:val="both"/>
         <w:rPr>
           <w:rFonts w:ascii="Times New Roman" w:hAnsi="Times New Roman" w:cs="Times New Roman"/>
         </w:rPr>
@@ -475,6 +484,7 @@
           <w:numId w:val="2"/>
         </w:numPr>
         <w:spacing w:before="40" w:after="40"/>
+        <w:jc w:val="both"/>
         <w:rPr>
           <w:rFonts w:ascii="Times New Roman" w:hAnsi="Times New Roman" w:cs="Times New Roman"/>
         </w:rPr>
@@ -494,6 +504,7 @@
           <w:numId w:val="2"/>
         </w:numPr>
         <w:spacing w:before="40" w:after="40"/>
+        <w:jc w:val="both"/>
         <w:rPr>
           <w:rFonts w:ascii="Times New Roman" w:hAnsi="Times New Roman" w:cs="Times New Roman"/>
         </w:rPr>
@@ -513,6 +524,7 @@
           <w:numId w:val="2"/>
         </w:numPr>
         <w:spacing w:before="40" w:after="40"/>
+        <w:jc w:val="both"/>
         <w:rPr>
           <w:rFonts w:ascii="Times New Roman" w:hAnsi="Times New Roman" w:cs="Times New Roman"/>
         </w:rPr>
@@ -557,7 +569,7 @@
     <w:p>
       <w:pPr>
         <w:tabs>
-          <w:tab w:val="right" w:pos="9360"/>
+          <w:tab w:val="right" w:pos="10800"/>
         </w:tabs>
         <w:spacing w:before="160" w:after="40"/>
         <w:rPr>
@@ -588,6 +600,7 @@
     <w:p>
       <w:pPr>
         <w:spacing w:before="20" w:after="40"/>
+        <w:jc w:val="both"/>
         <w:rPr>
           <w:rFonts w:ascii="Times New Roman" w:hAnsi="Times New Roman" w:cs="Times New Roman"/>
         </w:rPr>
@@ -609,6 +622,7 @@
           <w:numId w:val="2"/>
         </w:numPr>
         <w:spacing w:before="40" w:after="40"/>
+        <w:jc w:val="both"/>
         <w:rPr>
           <w:rFonts w:ascii="Times New Roman" w:hAnsi="Times New Roman" w:cs="Times New Roman"/>
         </w:rPr>
@@ -628,6 +642,7 @@
           <w:numId w:val="2"/>
         </w:numPr>
         <w:spacing w:before="40" w:after="40"/>
+        <w:jc w:val="both"/>
         <w:rPr>
           <w:rFonts w:ascii="Times New Roman" w:hAnsi="Times New Roman" w:cs="Times New Roman"/>
         </w:rPr>
@@ -647,6 +662,7 @@
           <w:numId w:val="2"/>
         </w:numPr>
         <w:spacing w:before="40" w:after="40"/>
+        <w:jc w:val="both"/>
         <w:rPr>
           <w:rFonts w:ascii="Times New Roman" w:hAnsi="Times New Roman" w:cs="Times New Roman"/>
         </w:rPr>
@@ -661,7 +677,7 @@
     <w:p>
       <w:pPr>
         <w:tabs>
-          <w:tab w:val="right" w:pos="9360"/>
+          <w:tab w:val="right" w:pos="10800"/>
         </w:tabs>
         <w:spacing w:before="160" w:after="40"/>
         <w:rPr>
@@ -676,7 +692,6 @@
           <w:sz w:val="20"/>
           <w:szCs w:val="20"/>
         </w:rPr>
-        <w:lastRenderedPageBreak/>
         <w:t>Workflow-Based Automation of UI Software Testing</w:t>
       </w:r>
       <w:r>
@@ -702,6 +717,7 @@
     <w:p>
       <w:pPr>
         <w:spacing w:before="20" w:after="40"/>
+        <w:jc w:val="both"/>
         <w:rPr>
           <w:rFonts w:ascii="Times New Roman" w:hAnsi="Times New Roman" w:cs="Times New Roman"/>
         </w:rPr>
@@ -723,6 +739,7 @@
           <w:numId w:val="2"/>
         </w:numPr>
         <w:spacing w:before="40" w:after="40"/>
+        <w:jc w:val="both"/>
         <w:rPr>
           <w:rFonts w:ascii="Times New Roman" w:hAnsi="Times New Roman" w:cs="Times New Roman"/>
         </w:rPr>
@@ -742,6 +759,7 @@
           <w:numId w:val="2"/>
         </w:numPr>
         <w:spacing w:before="40" w:after="40"/>
+        <w:jc w:val="both"/>
         <w:rPr>
           <w:rFonts w:ascii="Times New Roman" w:hAnsi="Times New Roman" w:cs="Times New Roman"/>
         </w:rPr>
@@ -756,7 +774,7 @@
     <w:p>
       <w:pPr>
         <w:tabs>
-          <w:tab w:val="right" w:pos="9360"/>
+          <w:tab w:val="right" w:pos="10800"/>
         </w:tabs>
         <w:spacing w:before="160" w:after="40"/>
         <w:rPr>
@@ -771,6 +789,7 @@
           <w:sz w:val="20"/>
           <w:szCs w:val="20"/>
         </w:rPr>
+        <w:lastRenderedPageBreak/>
         <w:t>InfoBatch Software Upgrade &amp; Validation</w:t>
       </w:r>
       <w:r>
@@ -796,6 +815,7 @@
     <w:p>
       <w:pPr>
         <w:spacing w:before="20" w:after="40"/>
+        <w:jc w:val="both"/>
         <w:rPr>
           <w:rFonts w:ascii="Times New Roman" w:hAnsi="Times New Roman" w:cs="Times New Roman"/>
         </w:rPr>
@@ -817,6 +837,7 @@
           <w:numId w:val="2"/>
         </w:numPr>
         <w:spacing w:before="40" w:after="40"/>
+        <w:jc w:val="both"/>
         <w:rPr>
           <w:rFonts w:ascii="Times New Roman" w:hAnsi="Times New Roman" w:cs="Times New Roman"/>
         </w:rPr>
@@ -836,6 +857,7 @@
           <w:numId w:val="2"/>
         </w:numPr>
         <w:spacing w:before="40" w:after="40"/>
+        <w:jc w:val="both"/>
         <w:rPr>
           <w:rFonts w:ascii="Times New Roman" w:hAnsi="Times New Roman" w:cs="Times New Roman"/>
         </w:rPr>
@@ -998,7 +1020,7 @@
     <w:p>
       <w:pPr>
         <w:tabs>
-          <w:tab w:val="right" w:pos="9360"/>
+          <w:tab w:val="right" w:pos="10800"/>
         </w:tabs>
         <w:spacing w:before="160" w:after="40"/>
         <w:rPr>
@@ -1053,7 +1075,7 @@
     <w:p>
       <w:pPr>
         <w:tabs>
-          <w:tab w:val="right" w:pos="9360"/>
+          <w:tab w:val="right" w:pos="10800"/>
         </w:tabs>
         <w:spacing w:before="160" w:after="40"/>
         <w:rPr>
@@ -1137,7 +1159,7 @@
     </w:p>
     <w:tbl>
       <w:tblPr>
-        <w:tblW w:w="9360" w:type="dxa"/>
+        <w:tblW w:w="10710" w:type="dxa"/>
         <w:tblBorders>
           <w:top w:val="single" w:sz="4" w:space="0" w:color="auto"/>
           <w:left w:val="single" w:sz="4" w:space="0" w:color="auto"/>
@@ -1153,14 +1175,14 @@
         <w:tblLook w:val="04A0" w:firstRow="1" w:lastRow="0" w:firstColumn="1" w:lastColumn="0" w:noHBand="0" w:noVBand="1"/>
       </w:tblPr>
       <w:tblGrid>
-        <w:gridCol w:w="4590"/>
+        <w:gridCol w:w="5130"/>
         <w:gridCol w:w="3770"/>
-        <w:gridCol w:w="1000"/>
+        <w:gridCol w:w="1810"/>
       </w:tblGrid>
       <w:tr>
         <w:tc>
           <w:tcPr>
-            <w:tcW w:w="4590" w:type="dxa"/>
+            <w:tcW w:w="5130" w:type="dxa"/>
             <w:tcBorders>
               <w:top w:val="single" w:sz="1" w:space="0" w:color="DDDDDD"/>
               <w:left w:val="none" w:sz="0" w:space="0" w:color="FFFFFF"/>
@@ -1224,7 +1246,7 @@
         </w:tc>
         <w:tc>
           <w:tcPr>
-            <w:tcW w:w="1000" w:type="dxa"/>
+            <w:tcW w:w="1810" w:type="dxa"/>
             <w:tcBorders>
               <w:top w:val="single" w:sz="1" w:space="0" w:color="DDDDDD"/>
               <w:left w:val="none" w:sz="0" w:space="0" w:color="FFFFFF"/>
@@ -1260,7 +1282,7 @@
       <w:tr>
         <w:tc>
           <w:tcPr>
-            <w:tcW w:w="4590" w:type="dxa"/>
+            <w:tcW w:w="5130" w:type="dxa"/>
             <w:tcBorders>
               <w:top w:val="single" w:sz="1" w:space="0" w:color="DDDDDD"/>
               <w:left w:val="none" w:sz="0" w:space="0" w:color="FFFFFF"/>
@@ -1324,7 +1346,7 @@
         </w:tc>
         <w:tc>
           <w:tcPr>
-            <w:tcW w:w="1000" w:type="dxa"/>
+            <w:tcW w:w="1810" w:type="dxa"/>
             <w:tcBorders>
               <w:top w:val="single" w:sz="1" w:space="0" w:color="DDDDDD"/>
               <w:left w:val="none" w:sz="0" w:space="0" w:color="FFFFFF"/>
@@ -1360,7 +1382,7 @@
       <w:tr>
         <w:tc>
           <w:tcPr>
-            <w:tcW w:w="4590" w:type="dxa"/>
+            <w:tcW w:w="5130" w:type="dxa"/>
             <w:tcBorders>
               <w:top w:val="single" w:sz="1" w:space="0" w:color="DDDDDD"/>
               <w:left w:val="none" w:sz="0" w:space="0" w:color="FFFFFF"/>
@@ -1424,7 +1446,7 @@
         </w:tc>
         <w:tc>
           <w:tcPr>
-            <w:tcW w:w="1000" w:type="dxa"/>
+            <w:tcW w:w="1810" w:type="dxa"/>
             <w:tcBorders>
               <w:top w:val="single" w:sz="1" w:space="0" w:color="DDDDDD"/>
               <w:left w:val="none" w:sz="0" w:space="0" w:color="FFFFFF"/>
@@ -1460,7 +1482,7 @@
       <w:tr>
         <w:tc>
           <w:tcPr>
-            <w:tcW w:w="4590" w:type="dxa"/>
+            <w:tcW w:w="5130" w:type="dxa"/>
             <w:tcBorders>
               <w:top w:val="single" w:sz="1" w:space="0" w:color="DDDDDD"/>
               <w:left w:val="none" w:sz="0" w:space="0" w:color="FFFFFF"/>
@@ -1524,7 +1546,7 @@
         </w:tc>
         <w:tc>
           <w:tcPr>
-            <w:tcW w:w="1000" w:type="dxa"/>
+            <w:tcW w:w="1810" w:type="dxa"/>
             <w:tcBorders>
               <w:top w:val="single" w:sz="1" w:space="0" w:color="DDDDDD"/>
               <w:left w:val="none" w:sz="0" w:space="0" w:color="FFFFFF"/>
@@ -1560,7 +1582,7 @@
       <w:tr>
         <w:tc>
           <w:tcPr>
-            <w:tcW w:w="4590" w:type="dxa"/>
+            <w:tcW w:w="5130" w:type="dxa"/>
             <w:tcBorders>
               <w:top w:val="single" w:sz="1" w:space="0" w:color="DDDDDD"/>
               <w:left w:val="none" w:sz="0" w:space="0" w:color="FFFFFF"/>
@@ -1624,7 +1646,7 @@
         </w:tc>
         <w:tc>
           <w:tcPr>
-            <w:tcW w:w="1000" w:type="dxa"/>
+            <w:tcW w:w="1810" w:type="dxa"/>
             <w:tcBorders>
               <w:top w:val="single" w:sz="1" w:space="0" w:color="DDDDDD"/>
               <w:left w:val="none" w:sz="0" w:space="0" w:color="FFFFFF"/>
@@ -1660,7 +1682,7 @@
       <w:tr>
         <w:tc>
           <w:tcPr>
-            <w:tcW w:w="4590" w:type="dxa"/>
+            <w:tcW w:w="5130" w:type="dxa"/>
             <w:tcBorders>
               <w:top w:val="single" w:sz="1" w:space="0" w:color="DDDDDD"/>
               <w:left w:val="none" w:sz="0" w:space="0" w:color="FFFFFF"/>
@@ -1724,7 +1746,7 @@
         </w:tc>
         <w:tc>
           <w:tcPr>
-            <w:tcW w:w="1000" w:type="dxa"/>
+            <w:tcW w:w="1810" w:type="dxa"/>
             <w:tcBorders>
               <w:top w:val="single" w:sz="1" w:space="0" w:color="DDDDDD"/>
               <w:left w:val="none" w:sz="0" w:space="0" w:color="FFFFFF"/>
@@ -1852,7 +1874,7 @@
         </w:rPr>
         <w:t xml:space="preserve">, Genova, Italy. </w:t>
       </w:r>
-      <w:hyperlink r:id="rId9" w:history="1">
+      <w:hyperlink r:id="rId9" w:anchor="!/4376/presentation/10884" w:history="1">
         <w:r>
           <w:rPr>
             <w:rFonts w:ascii="Times New Roman" w:hAnsi="Times New Roman" w:cs="Times New Roman"/>
@@ -1861,7 +1883,22 @@
             <w:szCs w:val="17"/>
             <w:u w:val="single"/>
           </w:rPr>
-          <w:t>PubMed</w:t>
+          <w:t>DOI</w:t>
+        </w:r>
+      </w:hyperlink>
+      <w:r>
+        <w:t xml:space="preserve">  |  </w:t>
+      </w:r>
+      <w:hyperlink r:id="rId10" w:anchor="!/4376/presentation/10884" w:history="1">
+        <w:r>
+          <w:rPr>
+            <w:rFonts w:ascii="Times New Roman" w:hAnsi="Times New Roman" w:cs="Times New Roman"/>
+            <w:color w:val="2E5FA3"/>
+            <w:sz w:val="17"/>
+            <w:szCs w:val="17"/>
+            <w:u w:val="single"/>
+          </w:rPr>
+          <w:t>Presentation</w:t>
         </w:r>
       </w:hyperlink>
     </w:p>
@@ -1910,7 +1947,7 @@
         </w:rPr>
         <w:t xml:space="preserve">, Vol. 11316. </w:t>
       </w:r>
-      <w:hyperlink r:id="rId10" w:history="1">
+      <w:hyperlink r:id="rId11" w:anchor="!/4376/presentation/10884" w:history="1">
         <w:r>
           <w:rPr>
             <w:rFonts w:ascii="Times New Roman" w:hAnsi="Times New Roman" w:cs="Times New Roman"/>
@@ -1968,7 +2005,7 @@
         </w:rPr>
         <w:t xml:space="preserve">, Washington, D.C. </w:t>
       </w:r>
-      <w:hyperlink r:id="rId11" w:anchor="!/4376/presentation/10884" w:history="1">
+      <w:hyperlink r:id="rId12" w:anchor="!/4376/presentation/10884" w:history="1">
         <w:r>
           <w:rPr>
             <w:rFonts w:ascii="Times New Roman" w:hAnsi="Times New Roman" w:cs="Times New Roman"/>
@@ -1980,15 +2017,25 @@
           <w:t>Abstract</w:t>
         </w:r>
       </w:hyperlink>
+      <w:r>
+        <w:t xml:space="preserve">  |  </w:t>
+      </w:r>
+      <w:hyperlink r:id="rId13" w:anchor="!/4376/presentation/10884" w:history="1">
+        <w:r>
+          <w:rPr>
+            <w:rFonts w:ascii="Times New Roman" w:hAnsi="Times New Roman" w:cs="Times New Roman"/>
+            <w:color w:val="2E5FA3"/>
+            <w:sz w:val="17"/>
+            <w:szCs w:val="17"/>
+            <w:u w:val="single"/>
+          </w:rPr>
+          <w:t>Poster</w:t>
+        </w:r>
+      </w:hyperlink>
     </w:p>
     <w:p>
       <w:pPr>
         <w:spacing w:before="120" w:after="40"/>
-        <w:rPr>
-          <w:rFonts w:ascii="Times New Roman" w:hAnsi="Times New Roman" w:cs="Times New Roman"/>
-        </w:rPr>
-      </w:pPr>
-      <w:r>
         <w:rPr>
           <w:rFonts w:ascii="Times New Roman" w:hAnsi="Times New Roman" w:cs="Times New Roman"/>
           <w:b/>
@@ -1997,6 +2044,16 @@
           <w:iCs/>
           <w:color w:val="2E5FA3"/>
         </w:rPr>
+      </w:pPr>
+      <w:r>
+        <w:rPr>
+          <w:rFonts w:ascii="Times New Roman" w:hAnsi="Times New Roman" w:cs="Times New Roman"/>
+          <w:b/>
+          <w:bCs/>
+          <w:i/>
+          <w:iCs/>
+          <w:color w:val="2E5FA3"/>
+        </w:rPr>
         <w:t>Invited Talks &amp; Conference Presentations</w:t>
       </w:r>
     </w:p>
@@ -2025,7 +2082,7 @@
           <w:sz w:val="17"/>
           <w:szCs w:val="17"/>
         </w:rPr>
-        <w:t xml:space="preserve">Shi, H. (2025, March). The ultimate Swiss army knife of UI software testing: Accelerating workflow-based automation [Conference talk]. </w:t>
+        <w:t xml:space="preserve">Shi, H. (2026, June). Reducing barriers to test automation through AI-assisted development [Conference presentation]. </w:t>
       </w:r>
       <w:r>
         <w:rPr>
@@ -2035,7 +2092,7 @@
           <w:sz w:val="17"/>
           <w:szCs w:val="17"/>
         </w:rPr>
-        <w:t>Selenium Conference 2025</w:t>
+        <w:t>MCBK Annual UK Conference 2026</w:t>
       </w:r>
       <w:r>
         <w:rPr>
@@ -2043,9 +2100,97 @@
           <w:sz w:val="17"/>
           <w:szCs w:val="17"/>
         </w:rPr>
+        <w:t xml:space="preserve">, King’s College London, the Strand Campus, London, UK. </w:t>
+      </w:r>
+      <w:hyperlink r:id="rId14" w:anchor="!/4376/presentation/10884" w:history="1">
+        <w:r>
+          <w:rPr>
+            <w:rFonts w:ascii="Times New Roman" w:hAnsi="Times New Roman" w:cs="Times New Roman"/>
+            <w:color w:val="2E5FA3"/>
+            <w:sz w:val="17"/>
+            <w:szCs w:val="17"/>
+            <w:u w:val="single"/>
+          </w:rPr>
+          <w:t>Zenodo</w:t>
+        </w:r>
+      </w:hyperlink>
+      <w:r>
+        <w:t xml:space="preserve">  |  </w:t>
+      </w:r>
+      <w:hyperlink r:id="rId15" w:anchor="!/4376/presentation/10884" w:history="1">
+        <w:r>
+          <w:rPr>
+            <w:rFonts w:ascii="Times New Roman" w:hAnsi="Times New Roman" w:cs="Times New Roman"/>
+            <w:color w:val="2E5FA3"/>
+            <w:sz w:val="17"/>
+            <w:szCs w:val="17"/>
+            <w:u w:val="single"/>
+          </w:rPr>
+          <w:t>Program</w:t>
+        </w:r>
+      </w:hyperlink>
+    </w:p>
+    <w:p>
+      <w:pPr>
+        <w:spacing w:before="60" w:after="40"/>
+        <w:ind w:left="540" w:hanging="360"/>
+        <w:rPr>
+          <w:rFonts w:ascii="Times New Roman" w:hAnsi="Times New Roman" w:cs="Times New Roman"/>
+        </w:rPr>
+      </w:pPr>
+      <w:r>
+        <w:rPr>
+          <w:rFonts w:ascii="Times New Roman" w:hAnsi="Times New Roman" w:cs="Times New Roman"/>
+          <w:b/>
+          <w:bCs/>
+          <w:color w:val="2E5FA3"/>
+          <w:sz w:val="17"/>
+          <w:szCs w:val="17"/>
+        </w:rPr>
+        <w:t xml:space="preserve">[5]  </w:t>
+      </w:r>
+      <w:r>
+        <w:rPr>
+          <w:rFonts w:ascii="Times New Roman" w:hAnsi="Times New Roman" w:cs="Times New Roman"/>
+          <w:sz w:val="17"/>
+          <w:szCs w:val="17"/>
+        </w:rPr>
+        <w:t xml:space="preserve">Shi, H. (2025, March). The ultimate Swiss army knife of UI software testing: Accelerating workflow-based automation for medical imaging systems [Conference talk]. </w:t>
+      </w:r>
+      <w:r>
+        <w:rPr>
+          <w:rFonts w:ascii="Times New Roman" w:hAnsi="Times New Roman" w:cs="Times New Roman"/>
+          <w:i/>
+          <w:iCs/>
+          <w:sz w:val="17"/>
+          <w:szCs w:val="17"/>
+        </w:rPr>
+        <w:t>Selenium Conference 2025</w:t>
+      </w:r>
+      <w:r>
+        <w:rPr>
+          <w:rFonts w:ascii="Times New Roman" w:hAnsi="Times New Roman" w:cs="Times New Roman"/>
+          <w:sz w:val="17"/>
+          <w:szCs w:val="17"/>
+        </w:rPr>
         <w:t xml:space="preserve">, Valencia, Spain. </w:t>
       </w:r>
-      <w:hyperlink r:id="rId12" w:history="1">
+      <w:hyperlink r:id="rId16" w:anchor="!/4376/presentation/10884" w:history="1">
+        <w:r>
+          <w:rPr>
+            <w:rFonts w:ascii="Times New Roman" w:hAnsi="Times New Roman" w:cs="Times New Roman"/>
+            <w:color w:val="2E5FA3"/>
+            <w:sz w:val="17"/>
+            <w:szCs w:val="17"/>
+            <w:u w:val="single"/>
+          </w:rPr>
+          <w:t>Zenodo</w:t>
+        </w:r>
+      </w:hyperlink>
+      <w:r>
+        <w:t xml:space="preserve">  |  </w:t>
+      </w:r>
+      <w:hyperlink r:id="rId17" w:anchor="!/4376/presentation/10884" w:history="1">
         <w:r>
           <w:rPr>
             <w:rFonts w:ascii="Times New Roman" w:hAnsi="Times New Roman" w:cs="Times New Roman"/>
@@ -2075,8 +2220,7 @@
           <w:sz w:val="17"/>
           <w:szCs w:val="17"/>
         </w:rPr>
-        <w:lastRenderedPageBreak/>
-        <w:t xml:space="preserve">[5]  </w:t>
+        <w:t xml:space="preserve">[6]  </w:t>
       </w:r>
       <w:r>
         <w:rPr>
@@ -2084,7 +2228,23 @@
           <w:sz w:val="17"/>
           <w:szCs w:val="17"/>
         </w:rPr>
-        <w:t xml:space="preserve">Shi, H. (2024, July). Presenting a workflow of automating UI software testing and reviewing a commercial case study [Conference presentation]. </w:t>
+        <w:t xml:space="preserve">Shi, H. (2024, July). Presenting a workflow of automating UI software testing and reviewing a commercial case study [Conference </w:t>
+      </w:r>
+      <w:r>
+        <w:rPr>
+          <w:rFonts w:ascii="Times New Roman" w:hAnsi="Times New Roman" w:cs="Times New Roman"/>
+          <w:sz w:val="17"/>
+          <w:szCs w:val="17"/>
+        </w:rPr>
+        <w:t>Poster</w:t>
+      </w:r>
+      <w:r>
+        <w:rPr>
+          <w:rFonts w:ascii="Times New Roman" w:hAnsi="Times New Roman" w:cs="Times New Roman"/>
+          <w:sz w:val="17"/>
+          <w:szCs w:val="17"/>
+        </w:rPr>
+        <w:t xml:space="preserve">]. </w:t>
       </w:r>
       <w:r>
         <w:rPr>
@@ -2102,9 +2262,9 @@
           <w:sz w:val="17"/>
           <w:szCs w:val="17"/>
         </w:rPr>
-        <w:t xml:space="preserve">, Imperial College London. </w:t>
-      </w:r>
-      <w:hyperlink r:id="rId13" w:anchor="p2" w:history="1">
+        <w:t xml:space="preserve">, Imperial College London, London, UK. </w:t>
+      </w:r>
+      <w:hyperlink r:id="rId18" w:anchor="!/4376/presentation/10884" w:history="1">
         <w:r>
           <w:rPr>
             <w:rFonts w:ascii="Times New Roman" w:hAnsi="Times New Roman" w:cs="Times New Roman"/>
@@ -2113,7 +2273,22 @@
             <w:szCs w:val="17"/>
             <w:u w:val="single"/>
           </w:rPr>
-          <w:t>Abstract</w:t>
+          <w:t>Zenodo</w:t>
+        </w:r>
+      </w:hyperlink>
+      <w:r>
+        <w:t xml:space="preserve">  |  </w:t>
+      </w:r>
+      <w:hyperlink r:id="rId19" w:anchor="!/4376/presentation/10884" w:history="1">
+        <w:r>
+          <w:rPr>
+            <w:rFonts w:ascii="Times New Roman" w:hAnsi="Times New Roman" w:cs="Times New Roman"/>
+            <w:color w:val="2E5FA3"/>
+            <w:sz w:val="17"/>
+            <w:szCs w:val="17"/>
+            <w:u w:val="single"/>
+          </w:rPr>
+          <w:t>Program</w:t>
         </w:r>
       </w:hyperlink>
     </w:p>
@@ -2153,7 +2328,7 @@
           <w:sz w:val="17"/>
           <w:szCs w:val="17"/>
         </w:rPr>
-        <w:t xml:space="preserve">[6]  </w:t>
+        <w:t xml:space="preserve">[7]  </w:t>
       </w:r>
       <w:r>
         <w:rPr>
@@ -2181,7 +2356,7 @@
         </w:rPr>
         <w:t xml:space="preserve"> [Master’s thesis, Johns Hopkins University]. JScholarship. </w:t>
       </w:r>
-      <w:hyperlink r:id="rId14" w:history="1">
+      <w:hyperlink r:id="rId20" w:anchor="!/4376/presentation/10884" w:history="1">
         <w:r>
           <w:rPr>
             <w:rFonts w:ascii="Times New Roman" w:hAnsi="Times New Roman" w:cs="Times New Roman"/>
@@ -2211,7 +2386,7 @@
           <w:sz w:val="17"/>
           <w:szCs w:val="17"/>
         </w:rPr>
-        <w:t xml:space="preserve">[7]  </w:t>
+        <w:t xml:space="preserve">[8]  </w:t>
       </w:r>
       <w:r>
         <w:rPr>
@@ -2239,7 +2414,7 @@
         </w:rPr>
         <w:t xml:space="preserve"> [Undergraduate thesis, Georgia Institute of Technology]. Georgia Tech Repository. </w:t>
       </w:r>
-      <w:hyperlink r:id="rId15" w:history="1">
+      <w:hyperlink r:id="rId21" w:anchor="!/4376/presentation/10884" w:history="1">
         <w:r>
           <w:rPr>
             <w:rFonts w:ascii="Times New Roman" w:hAnsi="Times New Roman" w:cs="Times New Roman"/>
@@ -2254,7 +2429,7 @@
     </w:p>
     <w:sectPr>
       <w:pgSz w:w="12240" w:h="15840"/>
-      <w:pgMar w:top="1080" w:right="1440" w:bottom="1080" w:left="1440" w:header="708" w:footer="708" w:gutter="0"/>
+      <w:pgMar w:top="720" w:right="720" w:bottom="720" w:left="720" w:header="708" w:footer="708" w:gutter="0"/>
       <w:cols w:space="720"/>
       <w:docGrid w:linePitch="360"/>
     </w:sectPr>
@@ -3016,6 +3191,7 @@
   <w:style w:type="character" w:default="1" w:styleId="DefaultParagraphFont">
     <w:name w:val="Default Paragraph Font"/>
     <w:uiPriority w:val="1"/>
+    <w:semiHidden/>
     <w:unhideWhenUsed/>
   </w:style>
   <w:style w:type="table" w:default="1" w:styleId="TableNormal">

</xml_diff>